<commit_message>
Add daily paper discovery and transactional incremental index updates
</commit_message>
<xml_diff>
--- a/docs/四大顶会区块链智能合约论文问答系统操作手册.docx
+++ b/docs/四大顶会区块链智能合约论文问答系统操作手册.docx
@@ -1536,6 +1536,11 @@
       </w:r>
     </w:p>
     <w:p>
+      <w:r>
+        <w:t>新增的每日更新任务独立存在于 Windows 任务计划中。关闭本项目全 Docker 服务后，定时触发只记录 skipped_services，不抓取、不调用模型，也不会自动启动 Docker。若任务当前显示 Running，先等本轮结束再关闭；关闭未来自动触发的方法见第十四节。</w:t>
+      </w:r>
+    </w:p>
+    <w:p>
       <w:pPr>
         <w:pStyle w:val="Heading1"/>
       </w:pPr>
@@ -1801,17 +1806,7 @@
     </w:p>
     <w:p>
       <w:r>
-        <w:t xml:space="preserve">来源为指定 GitHub 目录的固定版本，只处理前四个安全会议：IEEE S&amp;P、ACM CCS、USENIX Security、NDSS。原目录有217条记录，标题去重后216篇。最终可问答全文数量以 </w:t>
-      </w:r>
-      <w:r>
-        <w:rPr>
-          <w:rFonts w:ascii="Consolas" w:hAnsi="Consolas"/>
-          <w:sz w:val="20"/>
-        </w:rPr>
-        <w:t>data/index_receipt.json</w:t>
-      </w:r>
-      <w:r>
-        <w:t xml:space="preserve"> 为准；原始目录和逐篇状态分别保存在 </w:t>
+        <w:t xml:space="preserve">首次建库来自指定 GitHub 目录的固定版本，只处理前四个安全会议：IEEE S&amp;P、ACM CCS、USENIX Security、NDSS。最初有217条记录，标题去重后216篇，其中126篇全文完成索引。原始快照保存在 </w:t>
       </w:r>
       <w:r>
         <w:rPr>
@@ -1831,7 +1826,37 @@
         <w:t>data/manifest.json</w:t>
       </w:r>
       <w:r>
-        <w:t>。</w:t>
+        <w:t xml:space="preserve"> 和 </w:t>
+      </w:r>
+      <w:r>
+        <w:rPr>
+          <w:rFonts w:ascii="Consolas" w:hAnsi="Consolas"/>
+          <w:sz w:val="20"/>
+        </w:rPr>
+        <w:t>data/index_receipt.json</w:t>
+      </w:r>
+      <w:r>
+        <w:t xml:space="preserve">。自动更新后，应用优先读取本机 </w:t>
+      </w:r>
+      <w:r>
+        <w:rPr>
+          <w:rFonts w:ascii="Consolas" w:hAnsi="Consolas"/>
+          <w:sz w:val="20"/>
+        </w:rPr>
+        <w:t>data/.live_manifest.json</w:t>
+      </w:r>
+      <w:r>
+        <w:t xml:space="preserve"> 和 </w:t>
+      </w:r>
+      <w:r>
+        <w:rPr>
+          <w:rFonts w:ascii="Consolas" w:hAnsi="Consolas"/>
+          <w:sz w:val="20"/>
+        </w:rPr>
+        <w:t>data/.live_index_receipt.json</w:t>
+      </w:r>
+      <w:r>
+        <w:t>；当前数量以网页实际显示和本机索引验收为准。</w:t>
       </w:r>
     </w:p>
     <w:p>
@@ -2660,6 +2685,933 @@
         <w:t>、API Key、数据库密码或会话Cookie。</w:t>
       </w:r>
     </w:p>
+    <w:p>
+      <w:pPr>
+        <w:pStyle w:val="Heading1"/>
+      </w:pPr>
+      <w:r>
+        <w:t>十四 每天自动检查新增论文</w:t>
+      </w:r>
+    </w:p>
+    <w:p>
+      <w:pPr>
+        <w:pStyle w:val="Heading2"/>
+      </w:pPr>
+      <w:r>
+        <w:t>1 本机已经启用的时间</w:t>
+      </w:r>
+    </w:p>
+    <w:p>
+      <w:pPr>
+        <w:spacing w:after="80" w:line="271" w:lineRule="auto"/>
+      </w:pPr>
+      <w:r>
+        <w:t xml:space="preserve">任务名是 </w:t>
+      </w:r>
+      <w:r>
+        <w:rPr>
+          <w:rFonts w:ascii="Consolas" w:hAnsi="Consolas"/>
+          <w:sz w:val="20"/>
+        </w:rPr>
+        <w:t>Top4Sec-SmartContract-RAG-DailyUpdate</w:t>
+      </w:r>
+      <w:r>
+        <w:t>，每天北京时间09:00触发。它由 Windows 任务计划运行，不需要打开浏览器或保持本次聊天。任务以当前已登录的 Windows 用户运行，不在任务参数中保存网页密码或模型密钥。</w:t>
+      </w:r>
+    </w:p>
+    <w:p>
+      <w:pPr>
+        <w:spacing w:after="80" w:line="271" w:lineRule="auto"/>
+      </w:pPr>
+      <w:r>
+        <w:t>自动执行要求：电脑已开机、Windows 用户已登录、Docker Desktop 引擎可连接，而且本项目的 app 和 lightrag 容器均在运行。建议使用第三节的全 Docker 启动方式。方式 A 的 PowerShell 后端不由该任务自动停启，因此自动更新会跳过；如需自动更新，请切换到方式 B。</w:t>
+      </w:r>
+    </w:p>
+    <w:p>
+      <w:pPr>
+        <w:spacing w:after="80" w:line="271" w:lineRule="auto"/>
+      </w:pPr>
+      <w:r>
+        <w:t>关机、睡眠或退出 Windows 登录期间不能保证09:00执行。Windows 已配置“错过后条件允许时补执行”，但不会补齐关机期间每天的检查。重新启动系统后如需立即检查，可手动触发一次。</w:t>
+      </w:r>
+    </w:p>
+    <w:p>
+      <w:pPr>
+        <w:pStyle w:val="Heading2"/>
+      </w:pPr>
+      <w:r>
+        <w:t>2 自动更新实际做什么</w:t>
+      </w:r>
+    </w:p>
+    <w:p>
+      <w:pPr>
+        <w:spacing w:after="80" w:line="271" w:lineRule="auto"/>
+      </w:pPr>
+      <w:r>
+        <w:t>1. 检查本项目全 Docker 服务是否就绪；关闭时只写跳过记录，不联网抓取、不启动容器。</w:t>
+      </w:r>
+    </w:p>
+    <w:p>
+      <w:pPr>
+        <w:spacing w:after="80" w:line="271" w:lineRule="auto"/>
+      </w:pPr>
+      <w:r>
+        <w:t>2. 从指定 GitHub 仓库获取最新 README 提交，只解析 S&amp;P、CCS、USENIX Security、NDSS，保存本次来源提交和目录快照。</w:t>
+      </w:r>
+    </w:p>
+    <w:p>
+      <w:pPr>
+        <w:spacing w:after="80" w:line="271" w:lineRule="auto"/>
+      </w:pPr>
+      <w:r>
+        <w:t>3. 比较标题和链接：已入库论文保留；只处理新论文、刚补出的新链接，以及尚未超过次数上限的更新失败项。旧目录失效链接不会每天整批重抓。</w:t>
+      </w:r>
+    </w:p>
+    <w:p>
+      <w:pPr>
+        <w:spacing w:after="80" w:line="271" w:lineRule="auto"/>
+      </w:pPr>
+      <w:r>
+        <w:t>4. 每轮最多下载10篇，校验 PDF、标题、页数和正文；相同 PDF 即使换标题，也不会重复入库。下载和新论文入库各最多自动尝试3次。</w:t>
+      </w:r>
+    </w:p>
+    <w:p>
+      <w:pPr>
+        <w:spacing w:after="80" w:line="271" w:lineRule="auto"/>
+      </w:pPr>
+      <w:r>
+        <w:t>5. 没有新增全文需要入库时结束，不停服务、不调用模型。只有目录更新但没有可读全文时，不会把目录条目当成已读论文。</w:t>
+      </w:r>
+    </w:p>
+    <w:p>
+      <w:pPr>
+        <w:spacing w:after="80" w:line="271" w:lineRule="auto"/>
+      </w:pPr>
+      <w:r>
+        <w:t>6. 新全文准备好后，等待 app 的在途请求结束，再停止本项目 app 和 lightrag；MySQL 不停止。复制当前索引，在副本上复用旧论文回执，仅对新增全文计算向量并补入结构图。</w:t>
+      </w:r>
+    </w:p>
+    <w:p>
+      <w:pPr>
+        <w:spacing w:after="80" w:line="271" w:lineRule="auto"/>
+      </w:pPr>
+      <w:r>
+        <w:t>7. 核对旧片段未丢失、索引数量和构建编号，验收成功后切换并重启两个服务。构建或重启失败则恢复旧索引；中断遗留的事务在下次运行时先恢复。</w:t>
+      </w:r>
+    </w:p>
+    <w:p>
+      <w:pPr>
+        <w:spacing w:after="80" w:line="271" w:lineRule="auto"/>
+      </w:pPr>
+      <w:r>
+        <w:t>只有新增全文的增量入库阶段会产生 Embedding 费用，不额外逐段调用回答模型抽取语义图，也不会重新计算全部旧论文。正式更新期间网页可能短暂无法访问；请等待服务恢复。旧问答记录、旧证据及原 DocTrace 项目不会被覆盖。</w:t>
+      </w:r>
+    </w:p>
+    <w:p>
+      <w:pPr>
+        <w:pStyle w:val="Heading2"/>
+      </w:pPr>
+      <w:r>
+        <w:t>3 查看任务和最近结果</w:t>
+      </w:r>
+    </w:p>
+    <w:p>
+      <w:pPr>
+        <w:keepNext/>
+        <w:spacing w:after="80" w:line="271" w:lineRule="auto"/>
+      </w:pPr>
+      <w:r>
+        <w:t>在 PowerShell 中进入项目后执行：</w:t>
+      </w:r>
+    </w:p>
+    <w:p>
+      <w:pPr>
+        <w:pStyle w:val="Command"/>
+        <w:keepNext/>
+        <w:keepLines/>
+      </w:pPr>
+      <w:r>
+        <w:t>.\scripts\manage-update-task.ps1 -Action status</w:t>
+      </w:r>
+    </w:p>
+    <w:p>
+      <w:pPr>
+        <w:pStyle w:val="Command"/>
+        <w:keepNext w:val="0"/>
+        <w:keepLines/>
+      </w:pPr>
+      <w:r>
+        <w:t>.\.venv\Scripts\python.exe -m app.update_papers status</w:t>
+      </w:r>
+    </w:p>
+    <w:p>
+      <w:pPr>
+        <w:spacing w:after="80" w:line="271" w:lineRule="auto"/>
+      </w:pPr>
+      <w:r>
+        <w:t>第一条查看 Windows 任务是否启用、下次时间、最近时间和 LastTaskResult；第二条查看本轮或最近完成的更新结果。任务执行期间显示 running，不会把上轮成功误当成本轮已完成。LastTaskResult 为0只表示该次任务正常结束，可能是无新增或服务已关闭，需要结合更新报告判断。</w:t>
+      </w:r>
+    </w:p>
+    <w:p>
+      <w:pPr>
+        <w:spacing w:after="80" w:line="271" w:lineRule="auto"/>
+      </w:pPr>
+      <w:r>
+        <w:t xml:space="preserve">每次检查都有独立目录 </w:t>
+      </w:r>
+      <w:r>
+        <w:rPr>
+          <w:rFonts w:ascii="Consolas" w:hAnsi="Consolas"/>
+          <w:sz w:val="20"/>
+        </w:rPr>
+        <w:t>runtime/updates/时间_编号/</w:t>
+      </w:r>
+      <w:r>
+        <w:t xml:space="preserve">，最近结果同时保存在 </w:t>
+      </w:r>
+      <w:r>
+        <w:rPr>
+          <w:rFonts w:ascii="Consolas" w:hAnsi="Consolas"/>
+          <w:sz w:val="20"/>
+        </w:rPr>
+        <w:t>runtime/updates/latest.json</w:t>
+      </w:r>
+      <w:r>
+        <w:t>。报告包括来源 commit、新标题和新链接数、下载结果、待入库数量、实际入库数量、失败阶段和受重试上限阻止的论文编号。SDK 详细日志只保存在对应目录的 sdk.private.log。日志、全文、索引副本和实时清单不自动上传 GitHub。</w:t>
+      </w:r>
+    </w:p>
+    <w:tbl>
+      <w:tblPr>
+        <w:tblW w:type="auto" w:w="0"/>
+        <w:tblLayout w:type="fixed"/>
+        <w:tblLook w:firstColumn="1" w:firstRow="1" w:lastColumn="0" w:lastRow="0" w:noHBand="0" w:noVBand="1" w:val="04A0"/>
+      </w:tblPr>
+      <w:tblGrid>
+        <w:gridCol w:w="3384"/>
+        <w:gridCol w:w="6696"/>
+      </w:tblGrid>
+      <w:tr>
+        <w:trPr>
+          <w:cantSplit/>
+          <w:tblHeader/>
+        </w:trPr>
+        <w:tc>
+          <w:tcPr>
+            <w:tcW w:type="dxa" w:w="3384"/>
+            <w:vAlign w:val="center"/>
+            <w:tcMar>
+              <w:top w:w="90" w:type="dxa"/>
+              <w:bottom w:w="90" w:type="dxa"/>
+              <w:left w:w="90" w:type="dxa"/>
+              <w:right w:w="90" w:type="dxa"/>
+            </w:tcMar>
+            <w:shd w:fill="E7E6E6"/>
+          </w:tcPr>
+          <w:p>
+            <w:pPr>
+              <w:spacing w:before="60" w:after="60"/>
+            </w:pPr>
+            <w:r>
+              <w:rPr>
+                <w:b/>
+                <w:sz w:val="20"/>
+              </w:rPr>
+              <w:t>状态</w:t>
+            </w:r>
+          </w:p>
+        </w:tc>
+        <w:tc>
+          <w:tcPr>
+            <w:tcW w:type="dxa" w:w="6696"/>
+            <w:vAlign w:val="center"/>
+            <w:tcMar>
+              <w:top w:w="90" w:type="dxa"/>
+              <w:bottom w:w="90" w:type="dxa"/>
+              <w:left w:w="90" w:type="dxa"/>
+              <w:right w:w="90" w:type="dxa"/>
+            </w:tcMar>
+            <w:shd w:fill="E7E6E6"/>
+          </w:tcPr>
+          <w:p>
+            <w:pPr>
+              <w:spacing w:before="60" w:after="60"/>
+            </w:pPr>
+            <w:r>
+              <w:rPr>
+                <w:b/>
+                <w:sz w:val="20"/>
+              </w:rPr>
+              <w:t>含义</w:t>
+            </w:r>
+          </w:p>
+        </w:tc>
+      </w:tr>
+      <w:tr>
+        <w:trPr>
+          <w:cantSplit/>
+        </w:trPr>
+        <w:tc>
+          <w:tcPr>
+            <w:tcW w:type="dxa" w:w="3384"/>
+            <w:vAlign w:val="center"/>
+            <w:tcMar>
+              <w:top w:w="90" w:type="dxa"/>
+              <w:bottom w:w="90" w:type="dxa"/>
+              <w:left w:w="90" w:type="dxa"/>
+              <w:right w:w="90" w:type="dxa"/>
+            </w:tcMar>
+          </w:tcPr>
+          <w:p>
+            <w:pPr>
+              <w:spacing w:before="60" w:after="60"/>
+            </w:pPr>
+            <w:r>
+              <w:rPr>
+                <w:b w:val="0"/>
+                <w:sz w:val="20"/>
+              </w:rPr>
+              <w:t>no_change</w:t>
+            </w:r>
+          </w:p>
+        </w:tc>
+        <w:tc>
+          <w:tcPr>
+            <w:tcW w:type="dxa" w:w="6696"/>
+            <w:vAlign w:val="center"/>
+            <w:tcMar>
+              <w:top w:w="90" w:type="dxa"/>
+              <w:bottom w:w="90" w:type="dxa"/>
+              <w:left w:w="90" w:type="dxa"/>
+              <w:right w:w="90" w:type="dxa"/>
+            </w:tcMar>
+          </w:tcPr>
+          <w:p>
+            <w:pPr>
+              <w:spacing w:before="60" w:after="60"/>
+            </w:pPr>
+            <w:r>
+              <w:rPr>
+                <w:b w:val="0"/>
+                <w:sz w:val="20"/>
+              </w:rPr>
+              <w:t>没有需要处理的新资料，未进行模型向量化</w:t>
+            </w:r>
+          </w:p>
+        </w:tc>
+      </w:tr>
+      <w:tr>
+        <w:trPr>
+          <w:cantSplit/>
+        </w:trPr>
+        <w:tc>
+          <w:tcPr>
+            <w:tcW w:type="dxa" w:w="3384"/>
+            <w:vAlign w:val="center"/>
+            <w:tcMar>
+              <w:top w:w="90" w:type="dxa"/>
+              <w:bottom w:w="90" w:type="dxa"/>
+              <w:left w:w="90" w:type="dxa"/>
+              <w:right w:w="90" w:type="dxa"/>
+            </w:tcMar>
+          </w:tcPr>
+          <w:p>
+            <w:pPr>
+              <w:spacing w:before="60" w:after="60"/>
+            </w:pPr>
+            <w:r>
+              <w:rPr>
+                <w:b w:val="0"/>
+                <w:sz w:val="20"/>
+              </w:rPr>
+              <w:t>updated</w:t>
+            </w:r>
+          </w:p>
+        </w:tc>
+        <w:tc>
+          <w:tcPr>
+            <w:tcW w:type="dxa" w:w="6696"/>
+            <w:vAlign w:val="center"/>
+            <w:tcMar>
+              <w:top w:w="90" w:type="dxa"/>
+              <w:bottom w:w="90" w:type="dxa"/>
+              <w:left w:w="90" w:type="dxa"/>
+              <w:right w:w="90" w:type="dxa"/>
+            </w:tcMar>
+          </w:tcPr>
+          <w:p>
+            <w:pPr>
+              <w:spacing w:before="60" w:after="60"/>
+            </w:pPr>
+            <w:r>
+              <w:rPr>
+                <w:b w:val="0"/>
+                <w:sz w:val="20"/>
+              </w:rPr>
+              <w:t>新全文已验收并切换，查看 added_to_index</w:t>
+            </w:r>
+          </w:p>
+        </w:tc>
+      </w:tr>
+      <w:tr>
+        <w:trPr>
+          <w:cantSplit/>
+        </w:trPr>
+        <w:tc>
+          <w:tcPr>
+            <w:tcW w:type="dxa" w:w="3384"/>
+            <w:vAlign w:val="center"/>
+            <w:tcMar>
+              <w:top w:w="90" w:type="dxa"/>
+              <w:bottom w:w="90" w:type="dxa"/>
+              <w:left w:w="90" w:type="dxa"/>
+              <w:right w:w="90" w:type="dxa"/>
+            </w:tcMar>
+          </w:tcPr>
+          <w:p>
+            <w:pPr>
+              <w:spacing w:before="60" w:after="60"/>
+            </w:pPr>
+            <w:r>
+              <w:rPr>
+                <w:b w:val="0"/>
+                <w:sz w:val="20"/>
+              </w:rPr>
+              <w:t>catalog_updated</w:t>
+            </w:r>
+          </w:p>
+        </w:tc>
+        <w:tc>
+          <w:tcPr>
+            <w:tcW w:type="dxa" w:w="6696"/>
+            <w:vAlign w:val="center"/>
+            <w:tcMar>
+              <w:top w:w="90" w:type="dxa"/>
+              <w:bottom w:w="90" w:type="dxa"/>
+              <w:left w:w="90" w:type="dxa"/>
+              <w:right w:w="90" w:type="dxa"/>
+            </w:tcMar>
+          </w:tcPr>
+          <w:p>
+            <w:pPr>
+              <w:spacing w:before="60" w:after="60"/>
+            </w:pPr>
+            <w:r>
+              <w:rPr>
+                <w:b w:val="0"/>
+                <w:sz w:val="20"/>
+              </w:rPr>
+              <w:t>目录有变化，但本轮没有新增可入库全文</w:t>
+            </w:r>
+          </w:p>
+        </w:tc>
+      </w:tr>
+      <w:tr>
+        <w:trPr>
+          <w:cantSplit/>
+        </w:trPr>
+        <w:tc>
+          <w:tcPr>
+            <w:tcW w:type="dxa" w:w="3384"/>
+            <w:vAlign w:val="center"/>
+            <w:tcMar>
+              <w:top w:w="90" w:type="dxa"/>
+              <w:bottom w:w="90" w:type="dxa"/>
+              <w:left w:w="90" w:type="dxa"/>
+              <w:right w:w="90" w:type="dxa"/>
+            </w:tcMar>
+          </w:tcPr>
+          <w:p>
+            <w:pPr>
+              <w:spacing w:before="60" w:after="60"/>
+            </w:pPr>
+            <w:r>
+              <w:rPr>
+                <w:b w:val="0"/>
+                <w:sz w:val="20"/>
+              </w:rPr>
+              <w:t>skipped_services</w:t>
+            </w:r>
+          </w:p>
+        </w:tc>
+        <w:tc>
+          <w:tcPr>
+            <w:tcW w:type="dxa" w:w="6696"/>
+            <w:vAlign w:val="center"/>
+            <w:tcMar>
+              <w:top w:w="90" w:type="dxa"/>
+              <w:bottom w:w="90" w:type="dxa"/>
+              <w:left w:w="90" w:type="dxa"/>
+              <w:right w:w="90" w:type="dxa"/>
+            </w:tcMar>
+          </w:tcPr>
+          <w:p>
+            <w:pPr>
+              <w:spacing w:before="60" w:after="60"/>
+            </w:pPr>
+            <w:r>
+              <w:rPr>
+                <w:b w:val="0"/>
+                <w:sz w:val="20"/>
+              </w:rPr>
+              <w:t>自动任务发现本项目全Docker服务未运行，未抓取</w:t>
+            </w:r>
+          </w:p>
+        </w:tc>
+      </w:tr>
+      <w:tr>
+        <w:trPr>
+          <w:cantSplit/>
+        </w:trPr>
+        <w:tc>
+          <w:tcPr>
+            <w:tcW w:type="dxa" w:w="3384"/>
+            <w:vAlign w:val="center"/>
+            <w:tcMar>
+              <w:top w:w="90" w:type="dxa"/>
+              <w:bottom w:w="90" w:type="dxa"/>
+              <w:left w:w="90" w:type="dxa"/>
+              <w:right w:w="90" w:type="dxa"/>
+            </w:tcMar>
+          </w:tcPr>
+          <w:p>
+            <w:pPr>
+              <w:spacing w:before="60" w:after="60"/>
+            </w:pPr>
+            <w:r>
+              <w:rPr>
+                <w:b w:val="0"/>
+                <w:sz w:val="20"/>
+              </w:rPr>
+              <w:t>pending_services</w:t>
+            </w:r>
+          </w:p>
+        </w:tc>
+        <w:tc>
+          <w:tcPr>
+            <w:tcW w:type="dxa" w:w="6696"/>
+            <w:vAlign w:val="center"/>
+            <w:tcMar>
+              <w:top w:w="90" w:type="dxa"/>
+              <w:bottom w:w="90" w:type="dxa"/>
+              <w:left w:w="90" w:type="dxa"/>
+              <w:right w:w="90" w:type="dxa"/>
+            </w:tcMar>
+          </w:tcPr>
+          <w:p>
+            <w:pPr>
+              <w:spacing w:before="60" w:after="60"/>
+            </w:pPr>
+            <w:r>
+              <w:rPr>
+                <w:b w:val="0"/>
+                <w:sz w:val="20"/>
+              </w:rPr>
+              <w:t>手动运行已准备全文，等待全Docker服务再入库</w:t>
+            </w:r>
+          </w:p>
+        </w:tc>
+      </w:tr>
+      <w:tr>
+        <w:trPr>
+          <w:cantSplit/>
+        </w:trPr>
+        <w:tc>
+          <w:tcPr>
+            <w:tcW w:type="dxa" w:w="3384"/>
+            <w:vAlign w:val="center"/>
+            <w:tcMar>
+              <w:top w:w="90" w:type="dxa"/>
+              <w:bottom w:w="90" w:type="dxa"/>
+              <w:left w:w="90" w:type="dxa"/>
+              <w:right w:w="90" w:type="dxa"/>
+            </w:tcMar>
+          </w:tcPr>
+          <w:p>
+            <w:pPr>
+              <w:spacing w:before="60" w:after="60"/>
+            </w:pPr>
+            <w:r>
+              <w:rPr>
+                <w:b w:val="0"/>
+                <w:sz w:val="20"/>
+              </w:rPr>
+              <w:t>already_running</w:t>
+            </w:r>
+          </w:p>
+        </w:tc>
+        <w:tc>
+          <w:tcPr>
+            <w:tcW w:type="dxa" w:w="6696"/>
+            <w:vAlign w:val="center"/>
+            <w:tcMar>
+              <w:top w:w="90" w:type="dxa"/>
+              <w:bottom w:w="90" w:type="dxa"/>
+              <w:left w:w="90" w:type="dxa"/>
+              <w:right w:w="90" w:type="dxa"/>
+            </w:tcMar>
+          </w:tcPr>
+          <w:p>
+            <w:pPr>
+              <w:spacing w:before="60" w:after="60"/>
+            </w:pPr>
+            <w:r>
+              <w:rPr>
+                <w:b w:val="0"/>
+                <w:sz w:val="20"/>
+              </w:rPr>
+              <w:t>已有另一轮更新，本次未重复执行</w:t>
+            </w:r>
+          </w:p>
+        </w:tc>
+      </w:tr>
+      <w:tr>
+        <w:trPr>
+          <w:cantSplit/>
+        </w:trPr>
+        <w:tc>
+          <w:tcPr>
+            <w:tcW w:type="dxa" w:w="3384"/>
+            <w:vAlign w:val="center"/>
+            <w:tcMar>
+              <w:top w:w="90" w:type="dxa"/>
+              <w:bottom w:w="90" w:type="dxa"/>
+              <w:left w:w="90" w:type="dxa"/>
+              <w:right w:w="90" w:type="dxa"/>
+            </w:tcMar>
+          </w:tcPr>
+          <w:p>
+            <w:pPr>
+              <w:spacing w:before="60" w:after="60"/>
+            </w:pPr>
+            <w:r>
+              <w:rPr>
+                <w:b w:val="0"/>
+                <w:sz w:val="20"/>
+              </w:rPr>
+              <w:t>retry_limit_reached</w:t>
+            </w:r>
+          </w:p>
+        </w:tc>
+        <w:tc>
+          <w:tcPr>
+            <w:tcW w:type="dxa" w:w="6696"/>
+            <w:vAlign w:val="center"/>
+            <w:tcMar>
+              <w:top w:w="90" w:type="dxa"/>
+              <w:bottom w:w="90" w:type="dxa"/>
+              <w:left w:w="90" w:type="dxa"/>
+              <w:right w:w="90" w:type="dxa"/>
+            </w:tcMar>
+          </w:tcPr>
+          <w:p>
+            <w:pPr>
+              <w:spacing w:before="60" w:after="60"/>
+            </w:pPr>
+            <w:r>
+              <w:rPr>
+                <w:b w:val="0"/>
+                <w:sz w:val="20"/>
+              </w:rPr>
+              <w:t>有论文达到3次上限，需要先排错再主动重试</w:t>
+            </w:r>
+          </w:p>
+        </w:tc>
+      </w:tr>
+      <w:tr>
+        <w:trPr>
+          <w:cantSplit/>
+        </w:trPr>
+        <w:tc>
+          <w:tcPr>
+            <w:tcW w:type="dxa" w:w="3384"/>
+            <w:vAlign w:val="center"/>
+            <w:tcMar>
+              <w:top w:w="90" w:type="dxa"/>
+              <w:bottom w:w="90" w:type="dxa"/>
+              <w:left w:w="90" w:type="dxa"/>
+              <w:right w:w="90" w:type="dxa"/>
+            </w:tcMar>
+          </w:tcPr>
+          <w:p>
+            <w:pPr>
+              <w:spacing w:before="60" w:after="60"/>
+            </w:pPr>
+            <w:r>
+              <w:rPr>
+                <w:b w:val="0"/>
+                <w:sz w:val="20"/>
+              </w:rPr>
+              <w:t>failed</w:t>
+            </w:r>
+          </w:p>
+        </w:tc>
+        <w:tc>
+          <w:tcPr>
+            <w:tcW w:type="dxa" w:w="6696"/>
+            <w:vAlign w:val="center"/>
+            <w:tcMar>
+              <w:top w:w="90" w:type="dxa"/>
+              <w:bottom w:w="90" w:type="dxa"/>
+              <w:left w:w="90" w:type="dxa"/>
+              <w:right w:w="90" w:type="dxa"/>
+            </w:tcMar>
+          </w:tcPr>
+          <w:p>
+            <w:pPr>
+              <w:spacing w:before="60" w:after="60"/>
+            </w:pPr>
+            <w:r>
+              <w:rPr>
+                <w:b w:val="0"/>
+                <w:sz w:val="20"/>
+              </w:rPr>
+              <w:t>本轮未完成；查看stage和对应私有日志，不删除构建锁冒充成功</w:t>
+            </w:r>
+          </w:p>
+        </w:tc>
+      </w:tr>
+    </w:tbl>
+    <w:p>
+      <w:pPr>
+        <w:spacing w:after="20"/>
+      </w:pPr>
+    </w:p>
+    <w:p>
+      <w:pPr>
+        <w:pStyle w:val="Heading2"/>
+      </w:pPr>
+      <w:r>
+        <w:t>4 不等到09点 现在手动检查</w:t>
+      </w:r>
+    </w:p>
+    <w:p>
+      <w:pPr>
+        <w:keepNext/>
+        <w:spacing w:after="80" w:line="271" w:lineRule="auto"/>
+      </w:pPr>
+      <w:r>
+        <w:t>仅检查目录，不下载全文、不入库、不停止服务：</w:t>
+      </w:r>
+    </w:p>
+    <w:p>
+      <w:pPr>
+        <w:pStyle w:val="Command"/>
+        <w:keepNext w:val="0"/>
+        <w:keepLines/>
+      </w:pPr>
+      <w:r>
+        <w:t>.\.venv\Scripts\python.exe -m app.update_papers check</w:t>
+      </w:r>
+    </w:p>
+    <w:p>
+      <w:pPr>
+        <w:keepNext/>
+        <w:spacing w:after="80" w:line="271" w:lineRule="auto"/>
+      </w:pPr>
+      <w:r>
+        <w:t>立即执行一轮更新：</w:t>
+      </w:r>
+    </w:p>
+    <w:p>
+      <w:pPr>
+        <w:pStyle w:val="Command"/>
+        <w:keepNext w:val="0"/>
+        <w:keepLines/>
+      </w:pPr>
+      <w:r>
+        <w:t>.\.venv\Scripts\python.exe -m app.update_papers run</w:t>
+      </w:r>
+    </w:p>
+    <w:p>
+      <w:pPr>
+        <w:spacing w:after="80" w:line="271" w:lineRule="auto"/>
+      </w:pPr>
+      <w:r>
+        <w:t>这条命令有新增全文时会计算向量并产生费用。不要预先自己停止 app 和 lightrag，协调器会在需要入库时自行等待、停止和恢复。若全 Docker 服务没有运行，手动命令可先下载并标记 pending_services；开启方式 B 后再次运行即可。</w:t>
+      </w:r>
+    </w:p>
+    <w:p>
+      <w:pPr>
+        <w:keepNext/>
+        <w:spacing w:after="80" w:line="271" w:lineRule="auto"/>
+      </w:pPr>
+      <w:r>
+        <w:t>若要测试与每日任务完全相同的启动路径：</w:t>
+      </w:r>
+    </w:p>
+    <w:p>
+      <w:pPr>
+        <w:pStyle w:val="Command"/>
+        <w:keepNext w:val="0"/>
+        <w:keepLines/>
+      </w:pPr>
+      <w:r>
+        <w:t>.\scripts\manage-update-task.ps1 -Action run</w:t>
+      </w:r>
+    </w:p>
+    <w:p>
+      <w:pPr>
+        <w:spacing w:after="80" w:line="271" w:lineRule="auto"/>
+      </w:pPr>
+      <w:r>
+        <w:t>此命令后台启动 Windows 任务，不会一直占用当前窗口。随后使用第三小节的 status 命令查看结果。</w:t>
+      </w:r>
+    </w:p>
+    <w:p>
+      <w:pPr>
+        <w:pStyle w:val="Heading2"/>
+      </w:pPr>
+      <w:r>
+        <w:t>5 暂停 恢复与删除定时任务</w:t>
+      </w:r>
+    </w:p>
+    <w:p>
+      <w:pPr>
+        <w:keepNext/>
+        <w:spacing w:after="80" w:line="271" w:lineRule="auto"/>
+      </w:pPr>
+      <w:r>
+        <w:t>暂停后续自动触发：</w:t>
+      </w:r>
+    </w:p>
+    <w:p>
+      <w:pPr>
+        <w:pStyle w:val="Command"/>
+        <w:keepNext w:val="0"/>
+        <w:keepLines/>
+      </w:pPr>
+      <w:r>
+        <w:t>.\scripts\manage-update-task.ps1 -Action disable</w:t>
+      </w:r>
+    </w:p>
+    <w:p>
+      <w:pPr>
+        <w:keepNext/>
+        <w:spacing w:after="80" w:line="271" w:lineRule="auto"/>
+      </w:pPr>
+      <w:r>
+        <w:t>恢复自动触发：</w:t>
+      </w:r>
+    </w:p>
+    <w:p>
+      <w:pPr>
+        <w:pStyle w:val="Command"/>
+        <w:keepNext w:val="0"/>
+        <w:keepLines/>
+      </w:pPr>
+      <w:r>
+        <w:t>.\scripts\manage-update-task.ps1 -Action enable</w:t>
+      </w:r>
+    </w:p>
+    <w:p>
+      <w:pPr>
+        <w:keepNext/>
+        <w:spacing w:after="80" w:line="271" w:lineRule="auto"/>
+      </w:pPr>
+      <w:r>
+        <w:t>彻底删除本项目计划任务，保留论文、索引和数据库：</w:t>
+      </w:r>
+    </w:p>
+    <w:p>
+      <w:pPr>
+        <w:pStyle w:val="Command"/>
+        <w:keepNext w:val="0"/>
+        <w:keepLines/>
+      </w:pPr>
+      <w:r>
+        <w:t>.\scripts\manage-update-task.ps1 -Action remove</w:t>
+      </w:r>
+    </w:p>
+    <w:p>
+      <w:pPr>
+        <w:spacing w:after="80" w:line="271" w:lineRule="auto"/>
+      </w:pPr>
+      <w:r>
+        <w:t>禁用或删除未来触发不会取消正在进行的更新。若显示 Running，先等待本轮完成，再关闭项目服务。也可在 Windows“任务计划程序”的“任务计划程序库”中找到相同任务名查看状态。</w:t>
+      </w:r>
+    </w:p>
+    <w:p>
+      <w:pPr>
+        <w:pStyle w:val="Heading2"/>
+      </w:pPr>
+      <w:r>
+        <w:t>6 新电脑安装与手动解除重试上限</w:t>
+      </w:r>
+    </w:p>
+    <w:p>
+      <w:pPr>
+        <w:keepNext/>
+        <w:spacing w:after="80" w:line="271" w:lineRule="auto"/>
+      </w:pPr>
+      <w:r>
+        <w:t>新电脑按第十节完成初始建库并开启全 Docker 服务后，只需安装一次：</w:t>
+      </w:r>
+    </w:p>
+    <w:p>
+      <w:pPr>
+        <w:pStyle w:val="Command"/>
+        <w:keepNext w:val="0"/>
+        <w:keepLines/>
+      </w:pPr>
+      <w:r>
+        <w:t>.\scripts\manage-update-task.ps1 -Action install</w:t>
+      </w:r>
+    </w:p>
+    <w:p>
+      <w:pPr>
+        <w:spacing w:after="80" w:line="271" w:lineRule="auto"/>
+      </w:pPr>
+      <w:r>
+        <w:t>安装脚本要求 Windows 时区为UTC+8，默认每天09:00，使用本项目虚拟环境。Docker Compose 启动本身不会替你安装 Windows 任务。移动项目目录前先 remove，移动完成后在新目录重新 install，避免任务仍指向旧位置。</w:t>
+      </w:r>
+    </w:p>
+    <w:p>
+      <w:pPr>
+        <w:keepNext/>
+        <w:spacing w:after="80" w:line="271" w:lineRule="auto"/>
+      </w:pPr>
+      <w:r>
+        <w:t>遇到 retry_limit_reached，先查看报告中的 blocked_papers，修复网络、模型配置或来源链接后，把对应的新论文编号写入变量：</w:t>
+      </w:r>
+    </w:p>
+    <w:p>
+      <w:pPr>
+        <w:pStyle w:val="Command"/>
+        <w:keepNext/>
+        <w:keepLines/>
+      </w:pPr>
+      <w:r>
+        <w:t>$taskPaperId = '填写报告中的新论文编号'</w:t>
+      </w:r>
+    </w:p>
+    <w:p>
+      <w:pPr>
+        <w:pStyle w:val="Command"/>
+        <w:keepNext/>
+        <w:keepLines/>
+      </w:pPr>
+      <w:r>
+        <w:t>.\.venv\Scripts\python.exe -m app.update_papers retry --paper-id $taskPaperId</w:t>
+      </w:r>
+    </w:p>
+    <w:p>
+      <w:pPr>
+        <w:pStyle w:val="Command"/>
+        <w:keepNext w:val="0"/>
+        <w:keepLines/>
+      </w:pPr>
+      <w:r>
+        <w:t>.\.venv\Scripts\python.exe -m app.update_papers run</w:t>
+      </w:r>
+    </w:p>
+    <w:p>
+      <w:pPr>
+        <w:spacing w:after="80" w:line="271" w:lineRule="auto"/>
+      </w:pPr>
+      <w:r>
+        <w:t>retry 只重置这篇未入库论文的次数，不立即调用模型，也不能拿已入库旧论文反复重建。保留失败报告便于比较原因；不要删除 runtime、绕过验收标记或使用原 DocTrace 的存储目录。</w:t>
+      </w:r>
+    </w:p>
     <w:sectPr>
       <w:headerReference w:type="default" r:id="rId9"/>
       <w:footerReference w:type="default" r:id="rId10"/>

</xml_diff>